<commit_message>
Remove "Not applicable items receive no code" from legends
Drop the sentence from the code legend in the Word download, the user
manual's reporting legend, the reporting templates (.docx) and the
table draft. Rebuild docs.

Co-Authored-By: Claude Opus 5.5 <noreply@anthropic.com>
</commit_message>
<xml_diff>
--- a/docs/files/iceman-table-templates.docx
+++ b/docs/files/iceman-table-templates.docx
@@ -885,7 +885,7 @@
         <w:rPr>
           <w:rtl w:val="0"/>
         </w:rPr>
-        <w:t xml:space="preserve">(--) definitely reduces credibility; (-) probably reduces credibility or unclear; (+) probably increases credibility; (++) definitely increases credibility. Not applicable items receive no code.</w:t>
+        <w:t xml:space="preserve">(--) definitely reduces credibility; (-) probably reduces credibility or unclear; (+) probably increases credibility; (++) definitely increases credibility.</w:t>
       </w:r>
     </w:p>
     <w:p>
@@ -2040,7 +2040,7 @@
         <w:rPr>
           <w:rtl w:val="0"/>
         </w:rPr>
-        <w:t xml:space="preserve">(--) definitely reduces credibility; (-) probably reduces credibility or unclear; (+) probably increases credibility; (++) definitely increases credibility. Not applicable items receive no code.</w:t>
+        <w:t xml:space="preserve">(--) definitely reduces credibility; (-) probably reduces credibility or unclear; (+) probably increases credibility; (++) definitely increases credibility.</w:t>
       </w:r>
     </w:p>
     <w:p>
@@ -3824,7 +3824,7 @@
         <w:rPr>
           <w:rtl w:val="0"/>
         </w:rPr>
-        <w:t xml:space="preserve">(--) definitely reduces credibility; (-) probably reduces credibility or unclear; (+) probably increases credibility; (++) definitely increases credibility. Not applicable items receive no code.</w:t>
+        <w:t xml:space="preserve">(--) definitely reduces credibility; (-) probably reduces credibility or unclear; (+) probably increases credibility; (++) definitely increases credibility.</w:t>
       </w:r>
     </w:p>
     <w:p>

</xml_diff>